<commit_message>
Uploads for Module 13
Uploads for Module 13
</commit_message>
<xml_diff>
--- a/Lab Assignments/lab10A_FIRST_LAST.docx
+++ b/Lab Assignments/lab10A_FIRST_LAST.docx
@@ -1,6 +1,6 @@
 
 <file path=word/document.xml><?xml version="1.0" encoding="utf-8"?>
-<w:document xmlns:wpc="http://schemas.microsoft.com/office/word/2010/wordprocessingCanvas" xmlns:cx="http://schemas.microsoft.com/office/drawing/2014/chartex" xmlns:cx1="http://schemas.microsoft.com/office/drawing/2015/9/8/chartex" xmlns:cx2="http://schemas.microsoft.com/office/drawing/2015/10/21/chartex" xmlns:cx3="http://schemas.microsoft.com/office/drawing/2016/5/9/chartex" xmlns:cx4="http://schemas.microsoft.com/office/drawing/2016/5/10/chartex" xmlns:cx5="http://schemas.microsoft.com/office/drawing/2016/5/11/chartex" xmlns:cx6="http://schemas.microsoft.com/office/drawing/2016/5/12/chartex" xmlns:cx7="http://schemas.microsoft.com/office/drawing/2016/5/13/chartex" xmlns:cx8="http://schemas.microsoft.com/office/drawing/2016/5/14/chartex" xmlns:mc="http://schemas.openxmlformats.org/markup-compatibility/2006" xmlns:aink="http://schemas.microsoft.com/office/drawing/2016/ink" xmlns:am3d="http://schemas.microsoft.com/office/drawing/2017/model3d" xmlns:o="urn:schemas-microsoft-com:office:office" xmlns:r="http://schemas.openxmlformats.org/officeDocument/2006/relationships" xmlns:m="http://schemas.openxmlformats.org/officeDocument/2006/math" xmlns:v="urn:schemas-microsoft-com:vml" xmlns:wp14="http://schemas.microsoft.com/office/word/2010/wordprocessingDrawing" xmlns:wp="http://schemas.openxmlformats.org/drawingml/2006/wordprocessingDrawing" xmlns:w10="urn:schemas-microsoft-com:office:word" xmlns:w="http://schemas.openxmlformats.org/wordprocessingml/2006/main" xmlns:w14="http://schemas.microsoft.com/office/word/2010/wordml" xmlns:w15="http://schemas.microsoft.com/office/word/2012/wordml" xmlns:w16cid="http://schemas.microsoft.com/office/word/2016/wordml/cid" xmlns:w16se="http://schemas.microsoft.com/office/word/2015/wordml/symex" xmlns:wpg="http://schemas.microsoft.com/office/word/2010/wordprocessingGroup" xmlns:wpi="http://schemas.microsoft.com/office/word/2010/wordprocessingInk" xmlns:wne="http://schemas.microsoft.com/office/word/2006/wordml" xmlns:wps="http://schemas.microsoft.com/office/word/2010/wordprocessingShape" mc:Ignorable="w14 w15 w16se w16cid wp14">
+<w:document xmlns:wpc="http://schemas.microsoft.com/office/word/2010/wordprocessingCanvas" xmlns:cx="http://schemas.microsoft.com/office/drawing/2014/chartex" xmlns:cx1="http://schemas.microsoft.com/office/drawing/2015/9/8/chartex" xmlns:mc="http://schemas.openxmlformats.org/markup-compatibility/2006" xmlns:o="urn:schemas-microsoft-com:office:office" xmlns:r="http://schemas.openxmlformats.org/officeDocument/2006/relationships" xmlns:m="http://schemas.openxmlformats.org/officeDocument/2006/math" xmlns:v="urn:schemas-microsoft-com:vml" xmlns:wp14="http://schemas.microsoft.com/office/word/2010/wordprocessingDrawing" xmlns:wp="http://schemas.openxmlformats.org/drawingml/2006/wordprocessingDrawing" xmlns:w10="urn:schemas-microsoft-com:office:word" xmlns:w="http://schemas.openxmlformats.org/wordprocessingml/2006/main" xmlns:w14="http://schemas.microsoft.com/office/word/2010/wordml" xmlns:w15="http://schemas.microsoft.com/office/word/2012/wordml" xmlns:w16se="http://schemas.microsoft.com/office/word/2015/wordml/symex" xmlns:wpg="http://schemas.microsoft.com/office/word/2010/wordprocessingGroup" xmlns:wpi="http://schemas.microsoft.com/office/word/2010/wordprocessingInk" xmlns:wne="http://schemas.microsoft.com/office/word/2006/wordml" xmlns:wps="http://schemas.microsoft.com/office/word/2010/wordprocessingShape" mc:Ignorable="w14 w15 w16se wp14">
   <w:body>
     <w:p>
       <w:pPr>
@@ -1291,7 +1291,23 @@
         <w:t>class correlation coefficient</w:t>
       </w:r>
       <w:r>
-        <w:t>. This correlation tells us the degree to which scores from same group resemble each other (i.e., are observations more similar within groups than between groups) to calculate this, we will need the MSE for the error between groups, the MSE total within groups, and the number of observations per group (labelled ‘s’):</w:t>
+        <w:t xml:space="preserve">. This correlation tells us the degree to which scores from same group resemble each other (i.e., are observations more similar within groups than between groups) to calculate this, we will need the MSE for the error between groups, the MSE </w:t>
+      </w:r>
+      <w:r>
+        <w:t>total</w:t>
+      </w:r>
+      <w:bookmarkStart w:id="0" w:name="_GoBack"/>
+      <w:bookmarkEnd w:id="0"/>
+      <w:r>
+        <w:t xml:space="preserve"> within groups, and the number of observations per group (</w:t>
+      </w:r>
+      <w:proofErr w:type="gramStart"/>
+      <w:r>
+        <w:t>labelled ‘s’</w:t>
+      </w:r>
+      <w:proofErr w:type="gramEnd"/>
+      <w:r>
+        <w:t>):</w:t>
       </w:r>
     </w:p>
     <w:p>
@@ -2714,7 +2730,13 @@
         <w:t>class correlation coefficient</w:t>
       </w:r>
       <w:r>
-        <w:t>. This correlation tells us the degree to which scores from same group resemble each other (i.e., are observations more similar within groups than between groups) to calculate this, we will need the MSE for the error between groups, the MSE total within groups, and the number of observations per group (labelled ‘s’):</w:t>
+        <w:t xml:space="preserve">. This correlation tells us the degree to which scores from same group resemble each other (i.e., are observations more similar within groups than between groups) to calculate this, we will need the MSE for the error between groups, the MSE </w:t>
+      </w:r>
+      <w:r>
+        <w:t>residual</w:t>
+      </w:r>
+      <w:r>
+        <w:t xml:space="preserve"> within groups, and the number of observations per group (labelled ‘s’):</w:t>
       </w:r>
     </w:p>
     <w:p>
@@ -2904,12 +2926,7 @@
     </w:p>
     <w:p>
       <w:r>
-        <w:t xml:space="preserve">It is common for us to have “participant-level” data. That is, either an animal or human participant </w:t>
-      </w:r>
-      <w:bookmarkStart w:id="0" w:name="_GoBack"/>
-      <w:bookmarkEnd w:id="0"/>
-      <w:r>
-        <w:t xml:space="preserve">represents the level of analysis. As such, we often think of variables as between-subjects or within-subjects rather </w:t>
+        <w:t xml:space="preserve">It is common for us to have “participant-level” data. That is, either an animal or human participant represents the level of analysis. As such, we often think of variables as between-subjects or within-subjects rather </w:t>
       </w:r>
       <w:r>
         <w:t xml:space="preserve">than </w:t>
@@ -3199,7 +3216,7 @@
 </file>
 
 <file path=word/endnotes.xml><?xml version="1.0" encoding="utf-8"?>
-<w:endnotes xmlns:wpc="http://schemas.microsoft.com/office/word/2010/wordprocessingCanvas" xmlns:cx="http://schemas.microsoft.com/office/drawing/2014/chartex" xmlns:cx1="http://schemas.microsoft.com/office/drawing/2015/9/8/chartex" xmlns:cx2="http://schemas.microsoft.com/office/drawing/2015/10/21/chartex" xmlns:cx3="http://schemas.microsoft.com/office/drawing/2016/5/9/chartex" xmlns:cx4="http://schemas.microsoft.com/office/drawing/2016/5/10/chartex" xmlns:cx5="http://schemas.microsoft.com/office/drawing/2016/5/11/chartex" xmlns:cx6="http://schemas.microsoft.com/office/drawing/2016/5/12/chartex" xmlns:cx7="http://schemas.microsoft.com/office/drawing/2016/5/13/chartex" xmlns:cx8="http://schemas.microsoft.com/office/drawing/2016/5/14/chartex" xmlns:mc="http://schemas.openxmlformats.org/markup-compatibility/2006" xmlns:aink="http://schemas.microsoft.com/office/drawing/2016/ink" xmlns:am3d="http://schemas.microsoft.com/office/drawing/2017/model3d" xmlns:o="urn:schemas-microsoft-com:office:office" xmlns:r="http://schemas.openxmlformats.org/officeDocument/2006/relationships" xmlns:m="http://schemas.openxmlformats.org/officeDocument/2006/math" xmlns:v="urn:schemas-microsoft-com:vml" xmlns:wp14="http://schemas.microsoft.com/office/word/2010/wordprocessingDrawing" xmlns:wp="http://schemas.openxmlformats.org/drawingml/2006/wordprocessingDrawing" xmlns:w10="urn:schemas-microsoft-com:office:word" xmlns:w="http://schemas.openxmlformats.org/wordprocessingml/2006/main" xmlns:w14="http://schemas.microsoft.com/office/word/2010/wordml" xmlns:w15="http://schemas.microsoft.com/office/word/2012/wordml" xmlns:w16cid="http://schemas.microsoft.com/office/word/2016/wordml/cid" xmlns:w16se="http://schemas.microsoft.com/office/word/2015/wordml/symex" xmlns:wpg="http://schemas.microsoft.com/office/word/2010/wordprocessingGroup" xmlns:wpi="http://schemas.microsoft.com/office/word/2010/wordprocessingInk" xmlns:wne="http://schemas.microsoft.com/office/word/2006/wordml" xmlns:wps="http://schemas.microsoft.com/office/word/2010/wordprocessingShape" mc:Ignorable="w14 w15 w16se w16cid wp14">
+<w:endnotes xmlns:wpc="http://schemas.microsoft.com/office/word/2010/wordprocessingCanvas" xmlns:cx="http://schemas.microsoft.com/office/drawing/2014/chartex" xmlns:cx1="http://schemas.microsoft.com/office/drawing/2015/9/8/chartex" xmlns:mc="http://schemas.openxmlformats.org/markup-compatibility/2006" xmlns:o="urn:schemas-microsoft-com:office:office" xmlns:r="http://schemas.openxmlformats.org/officeDocument/2006/relationships" xmlns:m="http://schemas.openxmlformats.org/officeDocument/2006/math" xmlns:v="urn:schemas-microsoft-com:vml" xmlns:wp14="http://schemas.microsoft.com/office/word/2010/wordprocessingDrawing" xmlns:wp="http://schemas.openxmlformats.org/drawingml/2006/wordprocessingDrawing" xmlns:w10="urn:schemas-microsoft-com:office:word" xmlns:w="http://schemas.openxmlformats.org/wordprocessingml/2006/main" xmlns:w14="http://schemas.microsoft.com/office/word/2010/wordml" xmlns:w15="http://schemas.microsoft.com/office/word/2012/wordml" xmlns:w16se="http://schemas.microsoft.com/office/word/2015/wordml/symex" xmlns:wpg="http://schemas.microsoft.com/office/word/2010/wordprocessingGroup" xmlns:wpi="http://schemas.microsoft.com/office/word/2010/wordprocessingInk" xmlns:wne="http://schemas.microsoft.com/office/word/2006/wordml" xmlns:wps="http://schemas.microsoft.com/office/word/2010/wordprocessingShape" mc:Ignorable="w14 w15 w16se wp14">
   <w:endnote w:type="separator" w:id="-1">
     <w:p>
       <w:pPr>
@@ -3224,7 +3241,7 @@
 </file>
 
 <file path=word/footnotes.xml><?xml version="1.0" encoding="utf-8"?>
-<w:footnotes xmlns:wpc="http://schemas.microsoft.com/office/word/2010/wordprocessingCanvas" xmlns:cx="http://schemas.microsoft.com/office/drawing/2014/chartex" xmlns:cx1="http://schemas.microsoft.com/office/drawing/2015/9/8/chartex" xmlns:cx2="http://schemas.microsoft.com/office/drawing/2015/10/21/chartex" xmlns:cx3="http://schemas.microsoft.com/office/drawing/2016/5/9/chartex" xmlns:cx4="http://schemas.microsoft.com/office/drawing/2016/5/10/chartex" xmlns:cx5="http://schemas.microsoft.com/office/drawing/2016/5/11/chartex" xmlns:cx6="http://schemas.microsoft.com/office/drawing/2016/5/12/chartex" xmlns:cx7="http://schemas.microsoft.com/office/drawing/2016/5/13/chartex" xmlns:cx8="http://schemas.microsoft.com/office/drawing/2016/5/14/chartex" xmlns:mc="http://schemas.openxmlformats.org/markup-compatibility/2006" xmlns:aink="http://schemas.microsoft.com/office/drawing/2016/ink" xmlns:am3d="http://schemas.microsoft.com/office/drawing/2017/model3d" xmlns:o="urn:schemas-microsoft-com:office:office" xmlns:r="http://schemas.openxmlformats.org/officeDocument/2006/relationships" xmlns:m="http://schemas.openxmlformats.org/officeDocument/2006/math" xmlns:v="urn:schemas-microsoft-com:vml" xmlns:wp14="http://schemas.microsoft.com/office/word/2010/wordprocessingDrawing" xmlns:wp="http://schemas.openxmlformats.org/drawingml/2006/wordprocessingDrawing" xmlns:w10="urn:schemas-microsoft-com:office:word" xmlns:w="http://schemas.openxmlformats.org/wordprocessingml/2006/main" xmlns:w14="http://schemas.microsoft.com/office/word/2010/wordml" xmlns:w15="http://schemas.microsoft.com/office/word/2012/wordml" xmlns:w16cid="http://schemas.microsoft.com/office/word/2016/wordml/cid" xmlns:w16se="http://schemas.microsoft.com/office/word/2015/wordml/symex" xmlns:wpg="http://schemas.microsoft.com/office/word/2010/wordprocessingGroup" xmlns:wpi="http://schemas.microsoft.com/office/word/2010/wordprocessingInk" xmlns:wne="http://schemas.microsoft.com/office/word/2006/wordml" xmlns:wps="http://schemas.microsoft.com/office/word/2010/wordprocessingShape" mc:Ignorable="w14 w15 w16se w16cid wp14">
+<w:footnotes xmlns:wpc="http://schemas.microsoft.com/office/word/2010/wordprocessingCanvas" xmlns:cx="http://schemas.microsoft.com/office/drawing/2014/chartex" xmlns:cx1="http://schemas.microsoft.com/office/drawing/2015/9/8/chartex" xmlns:mc="http://schemas.openxmlformats.org/markup-compatibility/2006" xmlns:o="urn:schemas-microsoft-com:office:office" xmlns:r="http://schemas.openxmlformats.org/officeDocument/2006/relationships" xmlns:m="http://schemas.openxmlformats.org/officeDocument/2006/math" xmlns:v="urn:schemas-microsoft-com:vml" xmlns:wp14="http://schemas.microsoft.com/office/word/2010/wordprocessingDrawing" xmlns:wp="http://schemas.openxmlformats.org/drawingml/2006/wordprocessingDrawing" xmlns:w10="urn:schemas-microsoft-com:office:word" xmlns:w="http://schemas.openxmlformats.org/wordprocessingml/2006/main" xmlns:w14="http://schemas.microsoft.com/office/word/2010/wordml" xmlns:w15="http://schemas.microsoft.com/office/word/2012/wordml" xmlns:w16se="http://schemas.microsoft.com/office/word/2015/wordml/symex" xmlns:wpg="http://schemas.microsoft.com/office/word/2010/wordprocessingGroup" xmlns:wpi="http://schemas.microsoft.com/office/word/2010/wordprocessingInk" xmlns:wne="http://schemas.microsoft.com/office/word/2006/wordml" xmlns:wps="http://schemas.microsoft.com/office/word/2010/wordprocessingShape" mc:Ignorable="w14 w15 w16se wp14">
   <w:footnote w:type="separator" w:id="-1">
     <w:p>
       <w:pPr>
@@ -3249,7 +3266,7 @@
 </file>
 
 <file path=word/header1.xml><?xml version="1.0" encoding="utf-8"?>
-<w:hdr xmlns:wpc="http://schemas.microsoft.com/office/word/2010/wordprocessingCanvas" xmlns:cx="http://schemas.microsoft.com/office/drawing/2014/chartex" xmlns:cx1="http://schemas.microsoft.com/office/drawing/2015/9/8/chartex" xmlns:cx2="http://schemas.microsoft.com/office/drawing/2015/10/21/chartex" xmlns:cx3="http://schemas.microsoft.com/office/drawing/2016/5/9/chartex" xmlns:cx4="http://schemas.microsoft.com/office/drawing/2016/5/10/chartex" xmlns:cx5="http://schemas.microsoft.com/office/drawing/2016/5/11/chartex" xmlns:cx6="http://schemas.microsoft.com/office/drawing/2016/5/12/chartex" xmlns:cx7="http://schemas.microsoft.com/office/drawing/2016/5/13/chartex" xmlns:cx8="http://schemas.microsoft.com/office/drawing/2016/5/14/chartex" xmlns:mc="http://schemas.openxmlformats.org/markup-compatibility/2006" xmlns:aink="http://schemas.microsoft.com/office/drawing/2016/ink" xmlns:am3d="http://schemas.microsoft.com/office/drawing/2017/model3d" xmlns:o="urn:schemas-microsoft-com:office:office" xmlns:r="http://schemas.openxmlformats.org/officeDocument/2006/relationships" xmlns:m="http://schemas.openxmlformats.org/officeDocument/2006/math" xmlns:v="urn:schemas-microsoft-com:vml" xmlns:wp14="http://schemas.microsoft.com/office/word/2010/wordprocessingDrawing" xmlns:wp="http://schemas.openxmlformats.org/drawingml/2006/wordprocessingDrawing" xmlns:w10="urn:schemas-microsoft-com:office:word" xmlns:w="http://schemas.openxmlformats.org/wordprocessingml/2006/main" xmlns:w14="http://schemas.microsoft.com/office/word/2010/wordml" xmlns:w15="http://schemas.microsoft.com/office/word/2012/wordml" xmlns:w16cid="http://schemas.microsoft.com/office/word/2016/wordml/cid" xmlns:w16se="http://schemas.microsoft.com/office/word/2015/wordml/symex" xmlns:wpg="http://schemas.microsoft.com/office/word/2010/wordprocessingGroup" xmlns:wpi="http://schemas.microsoft.com/office/word/2010/wordprocessingInk" xmlns:wne="http://schemas.microsoft.com/office/word/2006/wordml" xmlns:wps="http://schemas.microsoft.com/office/word/2010/wordprocessingShape" mc:Ignorable="w14 w15 w16se w16cid wp14">
+<w:hdr xmlns:wpc="http://schemas.microsoft.com/office/word/2010/wordprocessingCanvas" xmlns:cx="http://schemas.microsoft.com/office/drawing/2014/chartex" xmlns:cx1="http://schemas.microsoft.com/office/drawing/2015/9/8/chartex" xmlns:mc="http://schemas.openxmlformats.org/markup-compatibility/2006" xmlns:o="urn:schemas-microsoft-com:office:office" xmlns:r="http://schemas.openxmlformats.org/officeDocument/2006/relationships" xmlns:m="http://schemas.openxmlformats.org/officeDocument/2006/math" xmlns:v="urn:schemas-microsoft-com:vml" xmlns:wp14="http://schemas.microsoft.com/office/word/2010/wordprocessingDrawing" xmlns:wp="http://schemas.openxmlformats.org/drawingml/2006/wordprocessingDrawing" xmlns:w10="urn:schemas-microsoft-com:office:word" xmlns:w="http://schemas.openxmlformats.org/wordprocessingml/2006/main" xmlns:w14="http://schemas.microsoft.com/office/word/2010/wordml" xmlns:w15="http://schemas.microsoft.com/office/word/2012/wordml" xmlns:w16se="http://schemas.microsoft.com/office/word/2015/wordml/symex" xmlns:wpg="http://schemas.microsoft.com/office/word/2010/wordprocessingGroup" xmlns:wpi="http://schemas.microsoft.com/office/word/2010/wordprocessingInk" xmlns:wne="http://schemas.microsoft.com/office/word/2006/wordml" xmlns:wps="http://schemas.microsoft.com/office/word/2010/wordprocessingShape" mc:Ignorable="w14 w15 w16se wp14">
   <w:p>
     <w:pPr>
       <w:pStyle w:val="Header"/>
@@ -3295,7 +3312,7 @@
 </file>
 
 <file path=word/numbering.xml><?xml version="1.0" encoding="utf-8"?>
-<w:numbering xmlns:wpc="http://schemas.microsoft.com/office/word/2010/wordprocessingCanvas" xmlns:cx="http://schemas.microsoft.com/office/drawing/2014/chartex" xmlns:cx1="http://schemas.microsoft.com/office/drawing/2015/9/8/chartex" xmlns:cx2="http://schemas.microsoft.com/office/drawing/2015/10/21/chartex" xmlns:cx3="http://schemas.microsoft.com/office/drawing/2016/5/9/chartex" xmlns:cx4="http://schemas.microsoft.com/office/drawing/2016/5/10/chartex" xmlns:cx5="http://schemas.microsoft.com/office/drawing/2016/5/11/chartex" xmlns:cx6="http://schemas.microsoft.com/office/drawing/2016/5/12/chartex" xmlns:cx7="http://schemas.microsoft.com/office/drawing/2016/5/13/chartex" xmlns:cx8="http://schemas.microsoft.com/office/drawing/2016/5/14/chartex" xmlns:mc="http://schemas.openxmlformats.org/markup-compatibility/2006" xmlns:aink="http://schemas.microsoft.com/office/drawing/2016/ink" xmlns:am3d="http://schemas.microsoft.com/office/drawing/2017/model3d" xmlns:o="urn:schemas-microsoft-com:office:office" xmlns:r="http://schemas.openxmlformats.org/officeDocument/2006/relationships" xmlns:m="http://schemas.openxmlformats.org/officeDocument/2006/math" xmlns:v="urn:schemas-microsoft-com:vml" xmlns:wp14="http://schemas.microsoft.com/office/word/2010/wordprocessingDrawing" xmlns:wp="http://schemas.openxmlformats.org/drawingml/2006/wordprocessingDrawing" xmlns:w10="urn:schemas-microsoft-com:office:word" xmlns:w="http://schemas.openxmlformats.org/wordprocessingml/2006/main" xmlns:w14="http://schemas.microsoft.com/office/word/2010/wordml" xmlns:w15="http://schemas.microsoft.com/office/word/2012/wordml" xmlns:w16cid="http://schemas.microsoft.com/office/word/2016/wordml/cid" xmlns:w16se="http://schemas.microsoft.com/office/word/2015/wordml/symex" xmlns:wpg="http://schemas.microsoft.com/office/word/2010/wordprocessingGroup" xmlns:wpi="http://schemas.microsoft.com/office/word/2010/wordprocessingInk" xmlns:wne="http://schemas.microsoft.com/office/word/2006/wordml" xmlns:wps="http://schemas.microsoft.com/office/word/2010/wordprocessingShape" mc:Ignorable="w14 w15 w16se w16cid wp14">
+<w:numbering xmlns:wpc="http://schemas.microsoft.com/office/word/2010/wordprocessingCanvas" xmlns:cx="http://schemas.microsoft.com/office/drawing/2014/chartex" xmlns:cx1="http://schemas.microsoft.com/office/drawing/2015/9/8/chartex" xmlns:mc="http://schemas.openxmlformats.org/markup-compatibility/2006" xmlns:o="urn:schemas-microsoft-com:office:office" xmlns:r="http://schemas.openxmlformats.org/officeDocument/2006/relationships" xmlns:m="http://schemas.openxmlformats.org/officeDocument/2006/math" xmlns:v="urn:schemas-microsoft-com:vml" xmlns:wp14="http://schemas.microsoft.com/office/word/2010/wordprocessingDrawing" xmlns:wp="http://schemas.openxmlformats.org/drawingml/2006/wordprocessingDrawing" xmlns:w10="urn:schemas-microsoft-com:office:word" xmlns:w="http://schemas.openxmlformats.org/wordprocessingml/2006/main" xmlns:w14="http://schemas.microsoft.com/office/word/2010/wordml" xmlns:w15="http://schemas.microsoft.com/office/word/2012/wordml" xmlns:w16se="http://schemas.microsoft.com/office/word/2015/wordml/symex" xmlns:wpg="http://schemas.microsoft.com/office/word/2010/wordprocessingGroup" xmlns:wpi="http://schemas.microsoft.com/office/word/2010/wordprocessingInk" xmlns:wne="http://schemas.microsoft.com/office/word/2006/wordml" xmlns:wps="http://schemas.microsoft.com/office/word/2010/wordprocessingShape" mc:Ignorable="w14 w15 w16se wp14">
   <w:abstractNum w:abstractNumId="0" w15:restartNumberingAfterBreak="0">
     <w:nsid w:val="04D05C64"/>
     <w:multiLevelType w:val="hybridMultilevel"/>
@@ -6061,7 +6078,7 @@
 </file>
 
 <file path=word/styles.xml><?xml version="1.0" encoding="utf-8"?>
-<w:styles xmlns:mc="http://schemas.openxmlformats.org/markup-compatibility/2006" xmlns:r="http://schemas.openxmlformats.org/officeDocument/2006/relationships" xmlns:w="http://schemas.openxmlformats.org/wordprocessingml/2006/main" xmlns:w14="http://schemas.microsoft.com/office/word/2010/wordml" xmlns:w15="http://schemas.microsoft.com/office/word/2012/wordml" xmlns:w16cid="http://schemas.microsoft.com/office/word/2016/wordml/cid" xmlns:w16se="http://schemas.microsoft.com/office/word/2015/wordml/symex" mc:Ignorable="w14 w15 w16se w16cid">
+<w:styles xmlns:mc="http://schemas.openxmlformats.org/markup-compatibility/2006" xmlns:r="http://schemas.openxmlformats.org/officeDocument/2006/relationships" xmlns:w="http://schemas.openxmlformats.org/wordprocessingml/2006/main" xmlns:w14="http://schemas.microsoft.com/office/word/2010/wordml" xmlns:w15="http://schemas.microsoft.com/office/word/2012/wordml" xmlns:w16se="http://schemas.microsoft.com/office/word/2015/wordml/symex" mc:Ignorable="w14 w15 w16se">
   <w:docDefaults>
     <w:rPrDefault>
       <w:rPr>
@@ -6077,7 +6094,7 @@
       </w:pPr>
     </w:pPrDefault>
   </w:docDefaults>
-  <w:latentStyles w:defLockedState="0" w:defUIPriority="99" w:defSemiHidden="0" w:defUnhideWhenUsed="0" w:defQFormat="0" w:count="376">
+  <w:latentStyles w:defLockedState="0" w:defUIPriority="99" w:defSemiHidden="0" w:defUnhideWhenUsed="0" w:defQFormat="0" w:count="371">
     <w:lsdException w:name="Normal" w:uiPriority="0" w:qFormat="1"/>
     <w:lsdException w:name="heading 1" w:uiPriority="9" w:qFormat="1"/>
     <w:lsdException w:name="heading 2" w:semiHidden="1" w:uiPriority="9" w:unhideWhenUsed="1" w:qFormat="1"/>
@@ -6183,6 +6200,7 @@
     <w:lsdException w:name="HTML Sample" w:semiHidden="1" w:unhideWhenUsed="1"/>
     <w:lsdException w:name="HTML Typewriter" w:semiHidden="1" w:unhideWhenUsed="1"/>
     <w:lsdException w:name="HTML Variable" w:semiHidden="1" w:unhideWhenUsed="1"/>
+    <w:lsdException w:name="Normal Table" w:semiHidden="1" w:unhideWhenUsed="1"/>
     <w:lsdException w:name="annotation subject" w:semiHidden="1" w:unhideWhenUsed="1"/>
     <w:lsdException w:name="No List" w:semiHidden="1" w:unhideWhenUsed="1"/>
     <w:lsdException w:name="Outline List 1" w:semiHidden="1" w:unhideWhenUsed="1"/>
@@ -6225,8 +6243,11 @@
     <w:lsdException w:name="Table Contemporary" w:semiHidden="1" w:unhideWhenUsed="1"/>
     <w:lsdException w:name="Table Elegant" w:semiHidden="1" w:unhideWhenUsed="1"/>
     <w:lsdException w:name="Table Professional" w:semiHidden="1" w:unhideWhenUsed="1"/>
+    <w:lsdException w:name="Table Subtle 1" w:semiHidden="1" w:unhideWhenUsed="1"/>
     <w:lsdException w:name="Table Subtle 2" w:semiHidden="1" w:unhideWhenUsed="1"/>
     <w:lsdException w:name="Table Web 1" w:semiHidden="1" w:unhideWhenUsed="1"/>
+    <w:lsdException w:name="Table Web 2" w:semiHidden="1" w:unhideWhenUsed="1"/>
+    <w:lsdException w:name="Table Web 3" w:semiHidden="1" w:unhideWhenUsed="1"/>
     <w:lsdException w:name="Balloon Text" w:semiHidden="1" w:unhideWhenUsed="1"/>
     <w:lsdException w:name="Table Grid" w:uiPriority="39"/>
     <w:lsdException w:name="Table Theme" w:semiHidden="1" w:unhideWhenUsed="1"/>
@@ -6445,11 +6466,6 @@
     <w:lsdException w:name="List Table 5 Dark Accent 6" w:uiPriority="50"/>
     <w:lsdException w:name="List Table 6 Colorful Accent 6" w:uiPriority="51"/>
     <w:lsdException w:name="List Table 7 Colorful Accent 6" w:uiPriority="52"/>
-    <w:lsdException w:name="Mention" w:semiHidden="1" w:unhideWhenUsed="1"/>
-    <w:lsdException w:name="Smart Hyperlink" w:semiHidden="1" w:unhideWhenUsed="1"/>
-    <w:lsdException w:name="Hashtag" w:semiHidden="1" w:unhideWhenUsed="1"/>
-    <w:lsdException w:name="Unresolved Mention" w:semiHidden="1" w:unhideWhenUsed="1"/>
-    <w:lsdException w:name="Smart Link" w:semiHidden="1" w:unhideWhenUsed="1"/>
   </w:latentStyles>
   <w:style w:type="paragraph" w:default="1" w:styleId="Normal">
     <w:name w:val="Normal"/>

</xml_diff>